<commit_message>
feat: Implement centroid enrichment for limits and zones
- Added centroid extraction and enrichment functionality to the LimitesPlugin and LimitesService.
- Introduced AltimetriaApi and LocalidadeApi for public enrichment of centroid data (elevation, municipality, state, country).
- Implemented a new "ATUALIZAR BASE" button in the UI to reload all shapes and recalculate centroids without reimporting the original vector.
- Updated VeraDataStructureUtil to include paths for centroid data storage.
- Enhanced VectorLayerGeometry with a method to calculate centroids from polygon geometries.
- Improved logging and error handling for API calls and data processing.
</commit_message>
<xml_diff>
--- a/docs/FUTURAS_AETHERIS.docx
+++ b/docs/FUTURAS_AETHERIS.docx
@@ -6,8 +6,179 @@
       <w:pPr>
         <w:jc w:val="both"/>
       </w:pPr>
+      <w:r>
+        <w:t>01:</w:t>
+      </w:r>
     </w:p>
-    <w:p/>
+    <w:p>
+      <w:pPr>
+        <w:jc w:val="both"/>
+      </w:pPr>
+      <w:r>
+        <w:t xml:space="preserve">É eu preciso da seguinte implementações essas implementações vão ser um pouco complicadinhas então cada cada implementação serão 22 APIs apias é então preciso que que essas APIs sejam seriam implementadas separadamente tá então como é que vai ser é tem uma informação que é o seguinte quando eu obtém tem 11 ferramenta de obter </w:t>
+      </w:r>
+      <w:proofErr w:type="spellStart"/>
+      <w:r>
+        <w:t>obter</w:t>
+      </w:r>
+      <w:proofErr w:type="spellEnd"/>
+      <w:r>
+        <w:t xml:space="preserve"> limites de talhões certo então essa ferramenta ela obtém o limite do talhão quando eu obtenho o limite do talhão eu quero agora colocar algumas informações públicas nesse talhão então ó é vai ser parte do protocolo desse </w:t>
+      </w:r>
+      <w:proofErr w:type="spellStart"/>
+      <w:r>
+        <w:t>taleão</w:t>
+      </w:r>
+      <w:proofErr w:type="spellEnd"/>
+      <w:r>
+        <w:t xml:space="preserve"> a gente primeiramente usando as úteis não é tem algumas vetor </w:t>
+      </w:r>
+      <w:proofErr w:type="spellStart"/>
+      <w:r>
+        <w:t>layers</w:t>
+      </w:r>
+      <w:proofErr w:type="spellEnd"/>
+      <w:r>
+        <w:t xml:space="preserve"> é ponto pie</w:t>
+      </w:r>
+      <w:r>
+        <w:t xml:space="preserve"> usar que algumas classes né Já trabalho cobertor é o que que eu quero eu quero que essas classes é eu quero que você pegue essas classes na primeira etapa é obter o centroide de cada talhão então assim os esse centroide do dos talhões vai ter todos os dados do talhões original inclusive esse centroide vai estar salvo dentro da pasta de cada talento tá é de cada talhão não desculpa de cada OS e então a primeira etapa né quando se obtém 11 limite um novo limite é a gente vai obter a gente vai obter o centroide isso para limite para a zona de manejo não só para limite então eu obtenho um limite extrai AO centroide o centroide vai ter lá no consolidado também que era um centroide total e também o centroide por OS então assim eu vou extrair o centroide desse talhão vou agora a gente vai implementar um </w:t>
+      </w:r>
+      <w:proofErr w:type="spellStart"/>
+      <w:r>
+        <w:t>mapeyer</w:t>
+      </w:r>
+      <w:proofErr w:type="spellEnd"/>
+      <w:r>
+        <w:t xml:space="preserve"> o que que essa </w:t>
+      </w:r>
+      <w:proofErr w:type="spellStart"/>
+      <w:r>
+        <w:t>piy</w:t>
+      </w:r>
+      <w:proofErr w:type="spellEnd"/>
+      <w:r>
+        <w:t xml:space="preserve"> ela precisa ela vai ser um </w:t>
+      </w:r>
+      <w:proofErr w:type="spellStart"/>
+      <w:r>
+        <w:t>apier</w:t>
+      </w:r>
+      <w:proofErr w:type="spellEnd"/>
+      <w:r>
+        <w:t xml:space="preserve"> pública pode ser </w:t>
+      </w:r>
+      <w:proofErr w:type="spellStart"/>
+      <w:r>
+        <w:t>opentopodata</w:t>
+      </w:r>
+      <w:proofErr w:type="spellEnd"/>
+      <w:r>
+        <w:t xml:space="preserve"> procure alguma API pública que obtenha dados de altimetria então assim a gente vai obter a altimetria daquele pra cada ponto então a gente vai ter que trabalhar com o sistema de </w:t>
+      </w:r>
+      <w:proofErr w:type="spellStart"/>
+      <w:r>
+        <w:t>task</w:t>
+      </w:r>
+      <w:proofErr w:type="spellEnd"/>
+      <w:r>
+        <w:t xml:space="preserve"> tá isso aí não pode rodar na No </w:t>
+      </w:r>
+      <w:proofErr w:type="spellStart"/>
+      <w:r>
+        <w:t>No</w:t>
+      </w:r>
+      <w:proofErr w:type="spellEnd"/>
+      <w:r>
+        <w:t xml:space="preserve"> trecho principal porque é um negócio que demora então eu obtenho ele vai para cada ponto para cada centroide extraído ele vai lá Na </w:t>
+      </w:r>
+      <w:proofErr w:type="spellStart"/>
+      <w:r>
+        <w:t>Na</w:t>
+      </w:r>
+      <w:proofErr w:type="spellEnd"/>
+      <w:r>
+        <w:t xml:space="preserve"> pia e vai buscar a altimetria dele e vai trazer essa altimetria para dentro do desse centroide vai obter essa essa altimetria né altitude né vai ter essa altitude e aí essa é a primeira etapa aí todos os centroide terão altimetria etapa 21 outra a piar e essa outra PAI vai fazer o quê ela vai buscar talvez deve existir alguma API do IBGE que traz a informação de município e estado então o que que eu preciso de município e estado então eu vou pegar esse </w:t>
+      </w:r>
+      <w:proofErr w:type="spellStart"/>
+      <w:r>
+        <w:t>esse</w:t>
+      </w:r>
+      <w:proofErr w:type="spellEnd"/>
+      <w:r>
+        <w:t xml:space="preserve"> ponto que é o </w:t>
+      </w:r>
+      <w:proofErr w:type="spellStart"/>
+      <w:r>
+        <w:t>xy</w:t>
+      </w:r>
+      <w:proofErr w:type="spellEnd"/>
+      <w:r>
+        <w:t xml:space="preserve"> do ponto vou subir no nessa API pode ser IBGE ou outra mas acho que a IBGE deve ter alguma e vão obter município e estado certo estado pode ser só </w:t>
+      </w:r>
+      <w:proofErr w:type="spellStart"/>
+      <w:r>
+        <w:t>só</w:t>
+      </w:r>
+      <w:proofErr w:type="spellEnd"/>
+      <w:r>
+        <w:t xml:space="preserve"> 2 letras né não precisa ser o nome completo do estado não e </w:t>
+      </w:r>
+      <w:proofErr w:type="spellStart"/>
+      <w:r>
+        <w:t>e</w:t>
+      </w:r>
+      <w:proofErr w:type="spellEnd"/>
+      <w:r>
+        <w:t xml:space="preserve"> aí tipo por </w:t>
+      </w:r>
+      <w:proofErr w:type="spellStart"/>
+      <w:r>
+        <w:t>por</w:t>
+      </w:r>
+      <w:proofErr w:type="spellEnd"/>
+      <w:r>
+        <w:t xml:space="preserve"> padrão acho que deve vim </w:t>
+      </w:r>
+      <w:proofErr w:type="spellStart"/>
+      <w:r>
+        <w:t>Oo</w:t>
+      </w:r>
+      <w:proofErr w:type="spellEnd"/>
+      <w:r>
+        <w:t xml:space="preserve"> país também coloca </w:t>
+      </w:r>
+      <w:proofErr w:type="spellStart"/>
+      <w:r>
+        <w:t>coloca</w:t>
+      </w:r>
+      <w:proofErr w:type="spellEnd"/>
+      <w:r>
+        <w:t xml:space="preserve"> o país também como uma terceira opção e aí nós vamos ter 11 consolidado total de centroides com todas essas informações que que eu preciso agora passar esses centroides passar essas informações para o talhão de volta então esses 3 Campos que a gente obtém 4 Campos desculpe que a gente obteve de cidade estado país e altimetria a gente vai colocar mas esses 4 atributos dentro dos talhões dos talhões </w:t>
+      </w:r>
+      <w:r>
+        <w:lastRenderedPageBreak/>
+        <w:t xml:space="preserve">é tu consolidado e por consequência também nos picotados que a gente tem nas 2 pastas de que a gente tem os centroides depois disso também vão ser quebrados EE serão colocadas somente na pasta privada né que chama </w:t>
+      </w:r>
+      <w:proofErr w:type="spellStart"/>
+      <w:r>
+        <w:t>verradata</w:t>
+      </w:r>
+      <w:proofErr w:type="spellEnd"/>
+      <w:r>
+        <w:t xml:space="preserve"> na pasta pública a gente não é por OOO centroide somente na pasta privada</w:t>
+      </w:r>
+    </w:p>
+    <w:p>
+      <w:pPr>
+        <w:jc w:val="both"/>
+      </w:pPr>
+    </w:p>
+    <w:p>
+      <w:pPr>
+        <w:jc w:val="both"/>
+      </w:pPr>
+    </w:p>
     <w:p>
       <w:pPr>
         <w:jc w:val="center"/>
@@ -1744,7 +1915,6 @@
   <w:style w:type="character" w:default="1" w:styleId="Fontepargpadro">
     <w:name w:val="Default Paragraph Font"/>
     <w:uiPriority w:val="1"/>
-    <w:semiHidden/>
     <w:unhideWhenUsed/>
   </w:style>
   <w:style w:type="table" w:default="1" w:styleId="Tabelanormal">

</xml_diff>